<commit_message>
course project design (word)
</commit_message>
<xml_diff>
--- a/7 семестр/ИСИС КП/ПЗ.docx
+++ b/7 семестр/ИСИС КП/ПЗ.docx
@@ -2900,8 +2900,10 @@
         <w:ind w:firstLine="0"/>
         <w:jc w:val="left"/>
         <w:rPr>
-          <w:b/>
-          <w:caps/>
+          <w:rFonts w:eastAsia="Times New Roman" w:cs="Times New Roman"/>
+          <w:sz w:val="24"/>
+          <w:szCs w:val="24"/>
+          <w:lang w:bidi="en-US"/>
         </w:rPr>
       </w:pPr>
       <w:r>
@@ -2910,6 +2912,206 @@
           <w:sz w:val="24"/>
           <w:szCs w:val="24"/>
           <w:lang w:val="en-US" w:bidi="en-US"/>
+        </w:rPr>
+        <w:br w:type="page"/>
+      </w:r>
+    </w:p>
+    <w:p>
+      <w:pPr>
+        <w:spacing w:after="160" w:line="259" w:lineRule="auto"/>
+        <w:ind w:firstLine="0"/>
+        <w:jc w:val="left"/>
+        <w:rPr>
+          <w:rFonts w:eastAsia="Times New Roman" w:cs="Times New Roman"/>
+          <w:sz w:val="24"/>
+          <w:szCs w:val="24"/>
+          <w:lang w:bidi="en-US"/>
+        </w:rPr>
+      </w:pPr>
+      <w:r>
+        <w:rPr>
+          <w:rFonts w:eastAsia="Times New Roman" w:cs="Times New Roman"/>
+          <w:noProof/>
+          <w:sz w:val="24"/>
+          <w:szCs w:val="24"/>
+          <w:lang w:bidi="en-US"/>
+        </w:rPr>
+        <w:lastRenderedPageBreak/>
+        <w:drawing>
+          <wp:anchor distT="0" distB="0" distL="114300" distR="114300" simplePos="0" relativeHeight="251658240" behindDoc="1" locked="0" layoutInCell="1" allowOverlap="1" wp14:anchorId="28CB5CAB" wp14:editId="179AC894">
+            <wp:simplePos x="0" y="0"/>
+            <wp:positionH relativeFrom="column">
+              <wp:posOffset>-1054195</wp:posOffset>
+            </wp:positionH>
+            <wp:positionV relativeFrom="paragraph">
+              <wp:posOffset>-852035</wp:posOffset>
+            </wp:positionV>
+            <wp:extent cx="7547610" cy="10668000"/>
+            <wp:effectExtent l="0" t="0" r="0" b="0"/>
+            <wp:wrapNone/>
+            <wp:docPr id="1854083058" name="Рисунок 1"/>
+            <wp:cNvGraphicFramePr>
+              <a:graphicFrameLocks xmlns:a="http://schemas.openxmlformats.org/drawingml/2006/main" noChangeAspect="1"/>
+            </wp:cNvGraphicFramePr>
+            <a:graphic xmlns:a="http://schemas.openxmlformats.org/drawingml/2006/main">
+              <a:graphicData uri="http://schemas.openxmlformats.org/drawingml/2006/picture">
+                <pic:pic xmlns:pic="http://schemas.openxmlformats.org/drawingml/2006/picture">
+                  <pic:nvPicPr>
+                    <pic:cNvPr id="1854083058" name="Рисунок 1854083058"/>
+                    <pic:cNvPicPr/>
+                  </pic:nvPicPr>
+                  <pic:blipFill>
+                    <a:blip r:embed="rId8">
+                      <a:extLst>
+                        <a:ext uri="{28A0092B-C50C-407E-A947-70E740481C1C}">
+                          <a14:useLocalDpi xmlns:a14="http://schemas.microsoft.com/office/drawing/2010/main" val="0"/>
+                        </a:ext>
+                      </a:extLst>
+                    </a:blip>
+                    <a:stretch>
+                      <a:fillRect/>
+                    </a:stretch>
+                  </pic:blipFill>
+                  <pic:spPr>
+                    <a:xfrm>
+                      <a:off x="0" y="0"/>
+                      <a:ext cx="7560362" cy="10686024"/>
+                    </a:xfrm>
+                    <a:prstGeom prst="rect">
+                      <a:avLst/>
+                    </a:prstGeom>
+                  </pic:spPr>
+                </pic:pic>
+              </a:graphicData>
+            </a:graphic>
+            <wp14:sizeRelH relativeFrom="page">
+              <wp14:pctWidth>0</wp14:pctWidth>
+            </wp14:sizeRelH>
+            <wp14:sizeRelV relativeFrom="page">
+              <wp14:pctHeight>0</wp14:pctHeight>
+            </wp14:sizeRelV>
+          </wp:anchor>
+        </w:drawing>
+      </w:r>
+    </w:p>
+    <w:p>
+      <w:pPr>
+        <w:spacing w:after="160" w:line="259" w:lineRule="auto"/>
+        <w:ind w:firstLine="0"/>
+        <w:jc w:val="left"/>
+        <w:rPr>
+          <w:rFonts w:eastAsia="Times New Roman" w:cs="Times New Roman"/>
+          <w:sz w:val="24"/>
+          <w:szCs w:val="24"/>
+          <w:lang w:bidi="en-US"/>
+        </w:rPr>
+      </w:pPr>
+      <w:r>
+        <w:rPr>
+          <w:rFonts w:eastAsia="Times New Roman" w:cs="Times New Roman"/>
+          <w:sz w:val="24"/>
+          <w:szCs w:val="24"/>
+          <w:lang w:bidi="en-US"/>
+        </w:rPr>
+        <w:br w:type="page"/>
+      </w:r>
+    </w:p>
+    <w:p>
+      <w:pPr>
+        <w:spacing w:after="160" w:line="259" w:lineRule="auto"/>
+        <w:ind w:firstLine="0"/>
+        <w:jc w:val="left"/>
+        <w:rPr>
+          <w:rFonts w:eastAsia="Times New Roman" w:cs="Times New Roman"/>
+          <w:sz w:val="24"/>
+          <w:szCs w:val="24"/>
+          <w:lang w:bidi="en-US"/>
+        </w:rPr>
+      </w:pPr>
+      <w:r>
+        <w:rPr>
+          <w:rFonts w:eastAsia="Times New Roman" w:cs="Times New Roman"/>
+          <w:noProof/>
+          <w:sz w:val="24"/>
+          <w:szCs w:val="24"/>
+          <w:lang w:bidi="en-US"/>
+        </w:rPr>
+        <w:lastRenderedPageBreak/>
+        <w:drawing>
+          <wp:anchor distT="0" distB="0" distL="114300" distR="114300" simplePos="0" relativeHeight="251659264" behindDoc="1" locked="0" layoutInCell="1" allowOverlap="1" wp14:anchorId="1E824E35" wp14:editId="659F6670">
+            <wp:simplePos x="0" y="0"/>
+            <wp:positionH relativeFrom="column">
+              <wp:posOffset>-1073650</wp:posOffset>
+            </wp:positionH>
+            <wp:positionV relativeFrom="paragraph">
+              <wp:posOffset>-877975</wp:posOffset>
+            </wp:positionV>
+            <wp:extent cx="7581089" cy="10714822"/>
+            <wp:effectExtent l="0" t="0" r="1270" b="0"/>
+            <wp:wrapNone/>
+            <wp:docPr id="435488286" name="Рисунок 2"/>
+            <wp:cNvGraphicFramePr>
+              <a:graphicFrameLocks xmlns:a="http://schemas.openxmlformats.org/drawingml/2006/main" noChangeAspect="1"/>
+            </wp:cNvGraphicFramePr>
+            <a:graphic xmlns:a="http://schemas.openxmlformats.org/drawingml/2006/main">
+              <a:graphicData uri="http://schemas.openxmlformats.org/drawingml/2006/picture">
+                <pic:pic xmlns:pic="http://schemas.openxmlformats.org/drawingml/2006/picture">
+                  <pic:nvPicPr>
+                    <pic:cNvPr id="435488286" name="Рисунок 435488286"/>
+                    <pic:cNvPicPr/>
+                  </pic:nvPicPr>
+                  <pic:blipFill>
+                    <a:blip r:embed="rId9">
+                      <a:extLst>
+                        <a:ext uri="{28A0092B-C50C-407E-A947-70E740481C1C}">
+                          <a14:useLocalDpi xmlns:a14="http://schemas.microsoft.com/office/drawing/2010/main" val="0"/>
+                        </a:ext>
+                      </a:extLst>
+                    </a:blip>
+                    <a:stretch>
+                      <a:fillRect/>
+                    </a:stretch>
+                  </pic:blipFill>
+                  <pic:spPr>
+                    <a:xfrm>
+                      <a:off x="0" y="0"/>
+                      <a:ext cx="7601961" cy="10744322"/>
+                    </a:xfrm>
+                    <a:prstGeom prst="rect">
+                      <a:avLst/>
+                    </a:prstGeom>
+                  </pic:spPr>
+                </pic:pic>
+              </a:graphicData>
+            </a:graphic>
+            <wp14:sizeRelH relativeFrom="page">
+              <wp14:pctWidth>0</wp14:pctWidth>
+            </wp14:sizeRelH>
+            <wp14:sizeRelV relativeFrom="page">
+              <wp14:pctHeight>0</wp14:pctHeight>
+            </wp14:sizeRelV>
+          </wp:anchor>
+        </w:drawing>
+      </w:r>
+    </w:p>
+    <w:p>
+      <w:pPr>
+        <w:spacing w:after="160" w:line="259" w:lineRule="auto"/>
+        <w:ind w:firstLine="0"/>
+        <w:jc w:val="left"/>
+        <w:rPr>
+          <w:rFonts w:eastAsia="Times New Roman" w:cs="Times New Roman"/>
+          <w:sz w:val="24"/>
+          <w:szCs w:val="24"/>
+          <w:lang w:bidi="en-US"/>
+        </w:rPr>
+      </w:pPr>
+      <w:r>
+        <w:rPr>
+          <w:rFonts w:eastAsia="Times New Roman" w:cs="Times New Roman"/>
+          <w:sz w:val="24"/>
+          <w:szCs w:val="24"/>
+          <w:lang w:bidi="en-US"/>
         </w:rPr>
         <w:br w:type="page"/>
       </w:r>
@@ -6232,7 +6434,6 @@
           <w:rFonts w:cs="Times New Roman"/>
           <w:i/>
           <w:iCs/>
-          <w:color w:val="EE0000"/>
           <w:szCs w:val="28"/>
         </w:rPr>
       </w:pPr>
@@ -6278,7 +6479,6 @@
           <w:rFonts w:cs="Times New Roman"/>
           <w:i/>
           <w:iCs/>
-          <w:color w:val="EE0000"/>
           <w:szCs w:val="28"/>
         </w:rPr>
         <w:t>Также реализовано резервирование. Допустимая отказоустойчивость сети – 0,2 сек.</w:t>
@@ -8596,13 +8796,15 @@
               <w:spacing w:line="240" w:lineRule="auto"/>
               <w:ind w:firstLine="0"/>
               <w:rPr>
-                <w:color w:val="EE0000"/>
-                <w:szCs w:val="28"/>
-              </w:rPr>
-            </w:pPr>
-            <w:r>
-              <w:rPr>
-                <w:color w:val="EE0000"/>
+                <w:i/>
+                <w:iCs/>
+                <w:szCs w:val="28"/>
+              </w:rPr>
+            </w:pPr>
+            <w:r>
+              <w:rPr>
+                <w:i/>
+                <w:iCs/>
                 <w:szCs w:val="28"/>
               </w:rPr>
               <w:t>0</w:t>
@@ -8619,13 +8821,15 @@
               <w:spacing w:line="240" w:lineRule="auto"/>
               <w:ind w:firstLine="0"/>
               <w:rPr>
-                <w:color w:val="EE0000"/>
-                <w:szCs w:val="28"/>
-              </w:rPr>
-            </w:pPr>
-            <w:r>
-              <w:rPr>
-                <w:color w:val="EE0000"/>
+                <w:i/>
+                <w:iCs/>
+                <w:szCs w:val="28"/>
+              </w:rPr>
+            </w:pPr>
+            <w:r>
+              <w:rPr>
+                <w:i/>
+                <w:iCs/>
                 <w:szCs w:val="28"/>
               </w:rPr>
               <w:t>-</w:t>
@@ -8641,14 +8845,16 @@
               <w:spacing w:line="240" w:lineRule="auto"/>
               <w:ind w:firstLine="0"/>
               <w:rPr>
-                <w:color w:val="EE0000"/>
+                <w:i/>
+                <w:iCs/>
                 <w:szCs w:val="28"/>
                 <w:lang w:val="en-US"/>
               </w:rPr>
             </w:pPr>
             <w:r>
               <w:rPr>
-                <w:color w:val="EE0000"/>
+                <w:i/>
+                <w:iCs/>
                 <w:szCs w:val="28"/>
                 <w:lang w:val="en-US"/>
               </w:rPr>
@@ -8665,14 +8871,16 @@
               <w:spacing w:line="240" w:lineRule="auto"/>
               <w:ind w:firstLine="0"/>
               <w:rPr>
-                <w:color w:val="EE0000"/>
+                <w:i/>
+                <w:iCs/>
                 <w:szCs w:val="28"/>
                 <w:lang w:val="en-US"/>
               </w:rPr>
             </w:pPr>
             <w:r>
               <w:rPr>
-                <w:color w:val="EE0000"/>
+                <w:i/>
+                <w:iCs/>
                 <w:szCs w:val="28"/>
                 <w:lang w:val="en-US"/>
               </w:rPr>
@@ -10393,138 +10601,59 @@
     <w:p>
       <w:pPr>
         <w:pStyle w:val="2"/>
-        <w:rPr>
-          <w:i/>
-          <w:iCs/>
-        </w:rPr>
       </w:pPr>
       <w:bookmarkStart w:id="9" w:name="_Toc216691453"/>
       <w:r>
-        <w:rPr>
-          <w:i/>
-          <w:iCs/>
-        </w:rPr>
         <w:lastRenderedPageBreak/>
         <w:t>2.3 Обеспечение отказоустойчивости компьютерной сети</w:t>
       </w:r>
       <w:bookmarkEnd w:id="9"/>
     </w:p>
-    <w:p>
-      <w:pPr>
-        <w:rPr>
-          <w:i/>
-          <w:iCs/>
-        </w:rPr>
-      </w:pPr>
-    </w:p>
-    <w:p>
-      <w:pPr>
-        <w:rPr>
-          <w:i/>
-          <w:iCs/>
-        </w:rPr>
-      </w:pPr>
-      <w:r>
-        <w:rPr>
-          <w:i/>
-          <w:iCs/>
-        </w:rPr>
+    <w:p/>
+    <w:p>
+      <w:r>
         <w:t xml:space="preserve">Необходимо обеспечить бесперебойное функционирование сети даже в случае отказа одного или нескольких компонентов. Для этого в сети поддерживается отказоустойчивость, достигаемая за счёт резервирования оборудования, т.е. создания избыточных элементов в сети. </w:t>
       </w:r>
     </w:p>
     <w:p>
-      <w:pPr>
-        <w:rPr>
-          <w:i/>
-          <w:iCs/>
-        </w:rPr>
-      </w:pPr>
-      <w:r>
-        <w:rPr>
-          <w:i/>
-          <w:iCs/>
-        </w:rPr>
+      <w:r>
         <w:t xml:space="preserve">«Бесшовное» резервирование для указанной задачи излишне трудоёмко, </w:t>
       </w:r>
       <w:r>
-        <w:rPr>
-          <w:i/>
-          <w:iCs/>
-        </w:rPr>
         <w:t>поэтому отказоустойчивость реализуется через технологию изменения топологии сети. Данный метод работает по протоколам, предотвращающим зацикливание путей между устройствами.</w:t>
       </w:r>
     </w:p>
     <w:p>
-      <w:pPr>
-        <w:rPr>
-          <w:i/>
-          <w:iCs/>
-        </w:rPr>
-      </w:pPr>
-      <w:r>
-        <w:rPr>
-          <w:i/>
-          <w:iCs/>
-        </w:rPr>
+      <w:r>
         <w:t xml:space="preserve">Мера отказоустойчивости – время схождения (конвергенции) сети, которое для данной задачи крайне мало – 0,2 секунды. По этой причине </w:t>
       </w:r>
       <w:r>
-        <w:rPr>
-          <w:i/>
-          <w:iCs/>
-        </w:rPr>
         <w:t xml:space="preserve">на коммутаторах будет настроен протокол </w:t>
       </w:r>
       <w:r>
         <w:rPr>
-          <w:i/>
-          <w:iCs/>
           <w:lang w:val="en-US"/>
         </w:rPr>
         <w:t>RSTP</w:t>
       </w:r>
       <w:r>
-        <w:rPr>
-          <w:i/>
-          <w:iCs/>
-        </w:rPr>
         <w:t xml:space="preserve">, ускоренное расширение стандартного протокола </w:t>
       </w:r>
       <w:r>
         <w:rPr>
-          <w:i/>
-          <w:iCs/>
           <w:lang w:val="en-US"/>
         </w:rPr>
         <w:t>STP</w:t>
       </w:r>
       <w:r>
-        <w:rPr>
-          <w:i/>
-          <w:iCs/>
-        </w:rPr>
         <w:t>.</w:t>
       </w:r>
     </w:p>
     <w:p>
-      <w:pPr>
-        <w:rPr>
-          <w:i/>
-          <w:iCs/>
-        </w:rPr>
-      </w:pPr>
-      <w:r>
-        <w:rPr>
-          <w:i/>
-          <w:iCs/>
-        </w:rPr>
+      <w:r>
         <w:t xml:space="preserve">Резервирование каналов реализуется через дублирование магистральных соединений между коммутаторами. </w:t>
       </w:r>
       <w:r>
-        <w:rPr>
-          <w:i/>
-          <w:iCs/>
-        </w:rPr>
         <w:t>В случае возникновения неисправности сеть будет динамически перестроена с учётом зарезервированных каналов передачи данных.</w:t>
       </w:r>
     </w:p>
@@ -15284,7 +15413,7 @@
               <w:rPr>
                 <w:rFonts w:cs="Times New Roman"/>
                 <w:szCs w:val="28"/>
-                <w:highlight w:val="yellow"/>
+                <w:u w:val="single"/>
                 <w:lang w:val="en-US"/>
               </w:rPr>
               <w:t>Sw1</w:t>
@@ -15295,7 +15424,15 @@
                 <w:szCs w:val="28"/>
                 <w:lang w:val="en-US"/>
               </w:rPr>
-              <w:t>-Fa0/</w:t>
+              <w:t>-F</w:t>
+            </w:r>
+            <w:r>
+              <w:rPr>
+                <w:rFonts w:cs="Times New Roman"/>
+                <w:szCs w:val="28"/>
+                <w:lang w:val="en-US"/>
+              </w:rPr>
+              <w:t>a0/</w:t>
             </w:r>
             <w:r>
               <w:rPr>
@@ -16327,7 +16464,7 @@
               <w:rPr>
                 <w:rFonts w:cs="Times New Roman"/>
                 <w:szCs w:val="28"/>
-                <w:highlight w:val="yellow"/>
+                <w:u w:val="single"/>
                 <w:lang w:val="en-US"/>
               </w:rPr>
               <w:t>Sw2</w:t>
@@ -17174,7 +17311,7 @@
               <w:rPr>
                 <w:rFonts w:cs="Times New Roman"/>
                 <w:szCs w:val="28"/>
-                <w:highlight w:val="yellow"/>
+                <w:u w:val="single"/>
                 <w:lang w:val="en-US"/>
               </w:rPr>
               <w:t>Sw3</w:t>
@@ -17806,7 +17943,7 @@
               <w:rPr>
                 <w:rFonts w:cs="Times New Roman"/>
                 <w:szCs w:val="28"/>
-                <w:highlight w:val="yellow"/>
+                <w:u w:val="single"/>
                 <w:lang w:val="en-US"/>
               </w:rPr>
               <w:t>Sw4</w:t>
@@ -18467,7 +18604,8 @@
               <w:jc w:val="center"/>
               <w:rPr>
                 <w:rFonts w:cs="Times New Roman"/>
-                <w:color w:val="EE0000"/>
+                <w:i/>
+                <w:iCs/>
                 <w:sz w:val="26"/>
                 <w:szCs w:val="26"/>
                 <w:lang w:val="en-US"/>
@@ -18476,7 +18614,8 @@
             <w:r>
               <w:rPr>
                 <w:rFonts w:cs="Times New Roman"/>
-                <w:color w:val="EE0000"/>
+                <w:i/>
+                <w:iCs/>
                 <w:sz w:val="26"/>
                 <w:szCs w:val="26"/>
                 <w:lang w:val="en-US"/>
@@ -18702,7 +18841,8 @@
               <w:jc w:val="center"/>
               <w:rPr>
                 <w:rFonts w:cs="Times New Roman"/>
-                <w:color w:val="EE0000"/>
+                <w:i/>
+                <w:iCs/>
                 <w:sz w:val="26"/>
                 <w:szCs w:val="26"/>
                 <w:lang w:val="en-US"/>
@@ -18711,7 +18851,8 @@
             <w:r>
               <w:rPr>
                 <w:rFonts w:cs="Times New Roman"/>
-                <w:color w:val="EE0000"/>
+                <w:i/>
+                <w:iCs/>
                 <w:sz w:val="26"/>
                 <w:szCs w:val="26"/>
                 <w:lang w:val="en-US"/>
@@ -21009,7 +21150,7 @@
                     <pic:cNvPicPr/>
                   </pic:nvPicPr>
                   <pic:blipFill>
-                    <a:blip r:embed="rId8">
+                    <a:blip r:embed="rId10">
                       <a:extLst>
                         <a:ext uri="{28A0092B-C50C-407E-A947-70E740481C1C}">
                           <a14:useLocalDpi xmlns:a14="http://schemas.microsoft.com/office/drawing/2010/main" val="0"/>
@@ -21262,7 +21403,7 @@
                     <pic:cNvPicPr/>
                   </pic:nvPicPr>
                   <pic:blipFill>
-                    <a:blip r:embed="rId9">
+                    <a:blip r:embed="rId11">
                       <a:extLst>
                         <a:ext uri="{28A0092B-C50C-407E-A947-70E740481C1C}">
                           <a14:useLocalDpi xmlns:a14="http://schemas.microsoft.com/office/drawing/2010/main" val="0"/>
@@ -21602,7 +21743,7 @@
                     <pic:cNvPicPr/>
                   </pic:nvPicPr>
                   <pic:blipFill>
-                    <a:blip r:embed="rId10"/>
+                    <a:blip r:embed="rId12"/>
                     <a:stretch>
                       <a:fillRect/>
                     </a:stretch>
@@ -21664,7 +21805,7 @@
                     <pic:cNvPicPr/>
                   </pic:nvPicPr>
                   <pic:blipFill>
-                    <a:blip r:embed="rId11"/>
+                    <a:blip r:embed="rId13"/>
                     <a:stretch>
                       <a:fillRect/>
                     </a:stretch>
@@ -24192,7 +24333,7 @@
                     </pic:cNvPicPr>
                   </pic:nvPicPr>
                   <pic:blipFill>
-                    <a:blip r:embed="rId12" cstate="print">
+                    <a:blip r:embed="rId14" cstate="print">
                       <a:extLst>
                         <a:ext uri="{28A0092B-C50C-407E-A947-70E740481C1C}">
                           <a14:useLocalDpi xmlns:a14="http://schemas.microsoft.com/office/drawing/2010/main" val="0"/>
@@ -31956,7 +32097,7 @@
                     <pic:cNvPicPr/>
                   </pic:nvPicPr>
                   <pic:blipFill>
-                    <a:blip r:embed="rId13"/>
+                    <a:blip r:embed="rId15"/>
                     <a:stretch>
                       <a:fillRect/>
                     </a:stretch>
@@ -32255,7 +32396,7 @@
                     <pic:cNvPicPr/>
                   </pic:nvPicPr>
                   <pic:blipFill>
-                    <a:blip r:embed="rId14"/>
+                    <a:blip r:embed="rId16"/>
                     <a:stretch>
                       <a:fillRect/>
                     </a:stretch>
@@ -32330,7 +32471,7 @@
                     <pic:cNvPicPr/>
                   </pic:nvPicPr>
                   <pic:blipFill>
-                    <a:blip r:embed="rId15"/>
+                    <a:blip r:embed="rId17"/>
                     <a:stretch>
                       <a:fillRect/>
                     </a:stretch>
@@ -32413,7 +32554,7 @@
                     <pic:cNvPicPr/>
                   </pic:nvPicPr>
                   <pic:blipFill>
-                    <a:blip r:embed="rId16"/>
+                    <a:blip r:embed="rId18"/>
                     <a:stretch>
                       <a:fillRect/>
                     </a:stretch>
@@ -32479,7 +32620,7 @@
                     <pic:cNvPicPr/>
                   </pic:nvPicPr>
                   <pic:blipFill>
-                    <a:blip r:embed="rId17"/>
+                    <a:blip r:embed="rId19"/>
                     <a:stretch>
                       <a:fillRect/>
                     </a:stretch>
@@ -32589,7 +32730,7 @@
                     <pic:cNvPicPr/>
                   </pic:nvPicPr>
                   <pic:blipFill>
-                    <a:blip r:embed="rId18"/>
+                    <a:blip r:embed="rId20"/>
                     <a:stretch>
                       <a:fillRect/>
                     </a:stretch>
@@ -33287,7 +33428,7 @@
                     <pic:cNvPicPr/>
                   </pic:nvPicPr>
                   <pic:blipFill>
-                    <a:blip r:embed="rId19">
+                    <a:blip r:embed="rId21">
                       <a:extLst>
                         <a:ext uri="{28A0092B-C50C-407E-A947-70E740481C1C}">
                           <a14:useLocalDpi xmlns:a14="http://schemas.microsoft.com/office/drawing/2010/main" val="0"/>
@@ -33416,7 +33557,7 @@
                     <pic:cNvPicPr/>
                   </pic:nvPicPr>
                   <pic:blipFill>
-                    <a:blip r:embed="rId20"/>
+                    <a:blip r:embed="rId22"/>
                     <a:stretch>
                       <a:fillRect/>
                     </a:stretch>
@@ -33465,8 +33606,8 @@
       </w:pPr>
     </w:p>
     <w:sectPr>
-      <w:headerReference w:type="default" r:id="rId21"/>
-      <w:footerReference w:type="default" r:id="rId22"/>
+      <w:headerReference w:type="default" r:id="rId23"/>
+      <w:footerReference w:type="default" r:id="rId24"/>
       <w:pgSz w:w="11906" w:h="16838"/>
       <w:pgMar w:top="1134" w:right="850" w:bottom="1134" w:left="1701" w:header="708" w:footer="708" w:gutter="0"/>
       <w:pgNumType w:start="1"/>

</xml_diff>